<commit_message>
rebuild the website with updates
</commit_message>
<xml_diff>
--- a/docs/do_not_upload/Assignment2/Assignment 2.docx
+++ b/docs/do_not_upload/Assignment2/Assignment 2.docx
@@ -756,21 +756,7 @@
         <w:rPr>
           <w:rFonts w:ascii="Times New Roman" w:hAnsi="Times New Roman" w:cs="Times New Roman"/>
         </w:rPr>
-        <w:t xml:space="preserve"> average package weight </w:t>
-      </w:r>
-      <w:proofErr w:type="gramStart"/>
-      <w:r>
-        <w:rPr>
-          <w:rFonts w:ascii="Times New Roman" w:hAnsi="Times New Roman" w:cs="Times New Roman"/>
-        </w:rPr>
-        <w:t>significantly</w:t>
-      </w:r>
-      <w:proofErr w:type="gramEnd"/>
-      <w:r>
-        <w:rPr>
-          <w:rFonts w:ascii="Times New Roman" w:hAnsi="Times New Roman" w:cs="Times New Roman"/>
-        </w:rPr>
-        <w:t xml:space="preserve"> less than 16.2 oz? Explain your reasoning</w:t>
+        <w:t xml:space="preserve"> average package weight significantly less than 16.2 oz? Explain your reasoning</w:t>
       </w:r>
       <w:r>
         <w:rPr>
@@ -1034,7 +1020,7 @@
         </w:rPr>
         <w:t xml:space="preserve"> (</w:t>
       </w:r>
-      <w:hyperlink r:id="rId6" w:tgtFrame="_new" w:history="1">
+      <w:hyperlink r:id="rId8" w:tgtFrame="_new" w:history="1">
         <w:r>
           <w:rPr>
             <w:rStyle w:val="Hyperlink"/>
@@ -1049,23 +1035,7 @@
           <w:sz w:val="22"/>
           <w:szCs w:val="22"/>
         </w:rPr>
-        <w:t xml:space="preserve">). Refer to the codebook provided in the first assignment and the corresponding tutorial for detailed information about the dataset, its variables, and the process for </w:t>
-      </w:r>
-      <w:proofErr w:type="gramStart"/>
-      <w:r>
-        <w:rPr>
-          <w:sz w:val="22"/>
-          <w:szCs w:val="22"/>
-        </w:rPr>
-        <w:t>recoding</w:t>
-      </w:r>
-      <w:proofErr w:type="gramEnd"/>
-      <w:r>
-        <w:rPr>
-          <w:sz w:val="22"/>
-          <w:szCs w:val="22"/>
-        </w:rPr>
-        <w:t xml:space="preserve"> missing values before conducting the analyses below.</w:t>
+        <w:t>). Refer to the codebook provided in the first assignment and the corresponding tutorial for detailed information about the dataset, its variables, and the process for recoding missing values before conducting the analyses below.</w:t>
       </w:r>
     </w:p>
     <w:p>
@@ -1092,7 +1062,47 @@
           <w:sz w:val="22"/>
           <w:szCs w:val="22"/>
         </w:rPr>
-        <w:t>average height of children starting kindergarten in the U.S. is 44 inches</w:t>
+        <w:t xml:space="preserve">average height of children starting kindergarten in the U.S. is </w:t>
+      </w:r>
+      <w:r>
+        <w:rPr>
+          <w:rStyle w:val="Strong"/>
+          <w:b w:val="0"/>
+          <w:bCs w:val="0"/>
+          <w:sz w:val="22"/>
+          <w:szCs w:val="22"/>
+        </w:rPr>
+        <w:t xml:space="preserve">less than </w:t>
+      </w:r>
+      <w:r>
+        <w:rPr>
+          <w:rStyle w:val="Strong"/>
+          <w:b w:val="0"/>
+          <w:bCs w:val="0"/>
+          <w:sz w:val="22"/>
+          <w:szCs w:val="22"/>
+        </w:rPr>
+        <w:t>4</w:t>
+      </w:r>
+      <w:r>
+        <w:rPr>
+          <w:rStyle w:val="Strong"/>
+          <w:b w:val="0"/>
+          <w:bCs w:val="0"/>
+          <w:sz w:val="22"/>
+          <w:szCs w:val="22"/>
+        </w:rPr>
+        <w:t>5</w:t>
+      </w:r>
+      <w:r>
+        <w:rPr>
+          <w:rStyle w:val="Strong"/>
+          <w:b w:val="0"/>
+          <w:bCs w:val="0"/>
+          <w:sz w:val="22"/>
+          <w:szCs w:val="22"/>
+        </w:rPr>
+        <w:t xml:space="preserve"> inches</w:t>
       </w:r>
       <w:r>
         <w:rPr>
@@ -1678,25 +1688,7 @@
           <w:color w:val="000000"/>
           <w:lang w:val="en-US"/>
         </w:rPr>
-        <w:t xml:space="preserve">The average height for ______ children in this </w:t>
-      </w:r>
-      <w:proofErr w:type="gramStart"/>
-      <w:r>
-        <w:rPr>
-          <w:rFonts w:ascii="Times New Roman" w:eastAsia="Times New Roman" w:hAnsi="Times New Roman" w:cs="Times New Roman"/>
-          <w:color w:val="000000"/>
-          <w:lang w:val="en-US"/>
-        </w:rPr>
-        <w:t>particular sample</w:t>
-      </w:r>
-      <w:proofErr w:type="gramEnd"/>
-      <w:r>
-        <w:rPr>
-          <w:rFonts w:ascii="Times New Roman" w:eastAsia="Times New Roman" w:hAnsi="Times New Roman" w:cs="Times New Roman"/>
-          <w:color w:val="000000"/>
-          <w:lang w:val="en-US"/>
-        </w:rPr>
-        <w:t xml:space="preserve"> was ______ with a standard deviation of _____. A one-sample </w:t>
+        <w:t xml:space="preserve">The average height for ______ children in this particular sample was ______ with a standard deviation of _____. A one-sample </w:t>
       </w:r>
       <w:r>
         <w:rPr>
@@ -1788,7 +1780,6 @@
         </w:rPr>
         <w:t xml:space="preserve"> the null hypothesis that the average height in the population is equal to 44 inches, </w:t>
       </w:r>
-      <w:proofErr w:type="gramStart"/>
       <w:r>
         <w:rPr>
           <w:rFonts w:ascii="Times New Roman" w:eastAsia="Times New Roman" w:hAnsi="Times New Roman" w:cs="Times New Roman"/>
@@ -1804,16 +1795,7 @@
           <w:color w:val="000000"/>
           <w:lang w:val="en-US"/>
         </w:rPr>
-        <w:t>(_</w:t>
-      </w:r>
-      <w:proofErr w:type="gramEnd"/>
-      <w:r>
-        <w:rPr>
-          <w:rFonts w:ascii="Times New Roman" w:eastAsia="Times New Roman" w:hAnsi="Times New Roman" w:cs="Times New Roman"/>
-          <w:color w:val="000000"/>
-          <w:lang w:val="en-US"/>
-        </w:rPr>
-        <w:t xml:space="preserve">____) = _____, </w:t>
+        <w:t xml:space="preserve">(_____) = _____, </w:t>
       </w:r>
       <w:r>
         <w:rPr>
@@ -1871,7 +1853,7 @@
           <w:szCs w:val="24"/>
         </w:rPr>
         <w:lastRenderedPageBreak/>
-        <w:t xml:space="preserve">Part </w:t>
+        <w:t>Part III</w:t>
       </w:r>
       <w:r>
         <w:rPr>
@@ -1881,7 +1863,7 @@
           <w:sz w:val="24"/>
           <w:szCs w:val="24"/>
         </w:rPr>
-        <w:t>II</w:t>
+        <w:t xml:space="preserve"> (15 pts)</w:t>
       </w:r>
       <w:r>
         <w:rPr>
@@ -1891,26 +1873,6 @@
           <w:sz w:val="24"/>
           <w:szCs w:val="24"/>
         </w:rPr>
-        <w:t>I</w:t>
-      </w:r>
-      <w:r>
-        <w:rPr>
-          <w:rFonts w:ascii="Times New Roman" w:hAnsi="Times New Roman" w:cs="Times New Roman"/>
-          <w:b/>
-          <w:bCs/>
-          <w:sz w:val="24"/>
-          <w:szCs w:val="24"/>
-        </w:rPr>
-        <w:t xml:space="preserve"> (15 pts)</w:t>
-      </w:r>
-      <w:r>
-        <w:rPr>
-          <w:rFonts w:ascii="Times New Roman" w:hAnsi="Times New Roman" w:cs="Times New Roman"/>
-          <w:b/>
-          <w:bCs/>
-          <w:sz w:val="24"/>
-          <w:szCs w:val="24"/>
-        </w:rPr>
         <w:t>. Understanding the data structure for an independent samples t-test</w:t>
       </w:r>
     </w:p>
@@ -1927,21 +1889,7 @@
         <w:rPr>
           <w:rFonts w:ascii="Times New Roman" w:hAnsi="Times New Roman" w:cs="Times New Roman"/>
         </w:rPr>
-        <w:t xml:space="preserve">Red 40, a </w:t>
-      </w:r>
-      <w:proofErr w:type="spellStart"/>
-      <w:r>
-        <w:rPr>
-          <w:rFonts w:ascii="Times New Roman" w:hAnsi="Times New Roman" w:cs="Times New Roman"/>
-        </w:rPr>
-        <w:t>monoazoaryl</w:t>
-      </w:r>
-      <w:proofErr w:type="spellEnd"/>
-      <w:r>
-        <w:rPr>
-          <w:rFonts w:ascii="Times New Roman" w:hAnsi="Times New Roman" w:cs="Times New Roman"/>
-        </w:rPr>
-        <w:t xml:space="preserve"> disodium disulfonate, has been approved in the U.S. since 1971 as a color additive in foods and drugs. To evaluate the safety of Red 40, researchers conducted a feeding experiment using mice. The mice were randomly assigned to either a </w:t>
+        <w:t xml:space="preserve">Red 40, a monoazoaryl disodium disulfonate, has been approved in the U.S. since 1971 as a color additive in foods and drugs. To evaluate the safety of Red 40, researchers conducted a feeding experiment using mice. The mice were randomly assigned to either a </w:t>
       </w:r>
       <w:r>
         <w:rPr>
@@ -2761,23 +2709,7 @@
           <w:sz w:val="22"/>
           <w:szCs w:val="22"/>
         </w:rPr>
-        <w:t xml:space="preserve">First, create the </w:t>
-      </w:r>
-      <w:proofErr w:type="gramStart"/>
-      <w:r>
-        <w:rPr>
-          <w:sz w:val="22"/>
-          <w:szCs w:val="22"/>
-        </w:rPr>
-        <w:t>dataset</w:t>
-      </w:r>
-      <w:proofErr w:type="gramEnd"/>
-      <w:r>
-        <w:rPr>
-          <w:sz w:val="22"/>
-          <w:szCs w:val="22"/>
-        </w:rPr>
-        <w:t xml:space="preserve"> in R using the code below.</w:t>
+        <w:t>First, create the dataset in R using the code below.</w:t>
       </w:r>
       <w:r>
         <w:rPr>
@@ -2856,23 +2788,7 @@
                 <w:rFonts w:ascii="Courier New" w:eastAsia="Courier New" w:hAnsi="Courier New" w:cs="Courier New"/>
                 <w:shd w:val="clear" w:color="auto" w:fill="F2F2F2"/>
               </w:rPr>
-              <w:t xml:space="preserve">time &lt;- </w:t>
-            </w:r>
-            <w:proofErr w:type="gramStart"/>
-            <w:r>
-              <w:rPr>
-                <w:rFonts w:ascii="Courier New" w:eastAsia="Courier New" w:hAnsi="Courier New" w:cs="Courier New"/>
-                <w:shd w:val="clear" w:color="auto" w:fill="F2F2F2"/>
-              </w:rPr>
-              <w:t>c(</w:t>
-            </w:r>
-            <w:proofErr w:type="gramEnd"/>
-            <w:r>
-              <w:rPr>
-                <w:rFonts w:ascii="Courier New" w:eastAsia="Courier New" w:hAnsi="Courier New" w:cs="Courier New"/>
-                <w:shd w:val="clear" w:color="auto" w:fill="F2F2F2"/>
-              </w:rPr>
-              <w:t>70, 77, 83, 87, 92, 93, 100, 102, 102, 103, 96,</w:t>
+              <w:t>time &lt;- c(70, 77, 83, 87, 92, 93, 100, 102, 102, 103, 96,</w:t>
             </w:r>
           </w:p>
           <w:p>
@@ -2966,23 +2882,7 @@
                 <w:shd w:val="clear" w:color="auto" w:fill="F2F2F2"/>
               </w:rPr>
               <w:lastRenderedPageBreak/>
-              <w:t xml:space="preserve">category &lt;- </w:t>
-            </w:r>
-            <w:proofErr w:type="gramStart"/>
-            <w:r>
-              <w:rPr>
-                <w:rFonts w:ascii="Courier New" w:eastAsia="Courier New" w:hAnsi="Courier New" w:cs="Courier New"/>
-                <w:shd w:val="clear" w:color="auto" w:fill="F2F2F2"/>
-              </w:rPr>
-              <w:t>c(rep(</w:t>
-            </w:r>
-            <w:proofErr w:type="gramEnd"/>
-            <w:r>
-              <w:rPr>
-                <w:rFonts w:ascii="Courier New" w:eastAsia="Courier New" w:hAnsi="Courier New" w:cs="Courier New"/>
-                <w:shd w:val="clear" w:color="auto" w:fill="F2F2F2"/>
-              </w:rPr>
-              <w:t>“control”, 11),</w:t>
+              <w:t>category &lt;- c(rep(“control”, 11),</w:t>
             </w:r>
           </w:p>
           <w:p>
@@ -2999,23 +2899,7 @@
                 <w:rFonts w:ascii="Courier New" w:eastAsia="Courier New" w:hAnsi="Courier New" w:cs="Courier New"/>
                 <w:shd w:val="clear" w:color="auto" w:fill="F2F2F2"/>
               </w:rPr>
-              <w:t xml:space="preserve">              </w:t>
-            </w:r>
-            <w:proofErr w:type="gramStart"/>
-            <w:r>
-              <w:rPr>
-                <w:rFonts w:ascii="Courier New" w:eastAsia="Courier New" w:hAnsi="Courier New" w:cs="Courier New"/>
-                <w:shd w:val="clear" w:color="auto" w:fill="F2F2F2"/>
-              </w:rPr>
-              <w:t>rep(</w:t>
-            </w:r>
-            <w:proofErr w:type="gramEnd"/>
-            <w:r>
-              <w:rPr>
-                <w:rFonts w:ascii="Courier New" w:eastAsia="Courier New" w:hAnsi="Courier New" w:cs="Courier New"/>
-                <w:shd w:val="clear" w:color="auto" w:fill="F2F2F2"/>
-              </w:rPr>
-              <w:t>“experiment”, 8))</w:t>
+              <w:t xml:space="preserve">              rep(“experiment”, 8))</w:t>
             </w:r>
           </w:p>
         </w:tc>
@@ -3086,39 +2970,12 @@
                 <w:shd w:val="clear" w:color="auto" w:fill="F2F2F2"/>
               </w:rPr>
             </w:pPr>
-            <w:proofErr w:type="spellStart"/>
             <w:r>
               <w:rPr>
                 <w:rFonts w:ascii="Courier New" w:eastAsia="Courier New" w:hAnsi="Courier New" w:cs="Courier New"/>
                 <w:shd w:val="clear" w:color="auto" w:fill="F2F2F2"/>
               </w:rPr>
-              <w:t>death_df</w:t>
-            </w:r>
-            <w:proofErr w:type="spellEnd"/>
-            <w:r>
-              <w:rPr>
-                <w:rFonts w:ascii="Courier New" w:eastAsia="Courier New" w:hAnsi="Courier New" w:cs="Courier New"/>
-                <w:shd w:val="clear" w:color="auto" w:fill="F2F2F2"/>
-              </w:rPr>
-              <w:t xml:space="preserve"> &lt;- </w:t>
-            </w:r>
-            <w:proofErr w:type="spellStart"/>
-            <w:proofErr w:type="gramStart"/>
-            <w:r>
-              <w:rPr>
-                <w:rFonts w:ascii="Courier New" w:eastAsia="Courier New" w:hAnsi="Courier New" w:cs="Courier New"/>
-                <w:shd w:val="clear" w:color="auto" w:fill="F2F2F2"/>
-              </w:rPr>
-              <w:t>data.frame</w:t>
-            </w:r>
-            <w:proofErr w:type="spellEnd"/>
-            <w:proofErr w:type="gramEnd"/>
-            <w:r>
-              <w:rPr>
-                <w:rFonts w:ascii="Courier New" w:eastAsia="Courier New" w:hAnsi="Courier New" w:cs="Courier New"/>
-                <w:shd w:val="clear" w:color="auto" w:fill="F2F2F2"/>
-              </w:rPr>
-              <w:t>(time, category)</w:t>
+              <w:t>death_df &lt;- data.frame(time, category)</w:t>
             </w:r>
           </w:p>
         </w:tc>
@@ -3205,55 +3062,12 @@
                 <w:shd w:val="clear" w:color="auto" w:fill="F2F2F2"/>
               </w:rPr>
             </w:pPr>
-            <w:proofErr w:type="spellStart"/>
             <w:r>
               <w:rPr>
                 <w:rFonts w:ascii="Courier New" w:eastAsia="Courier New" w:hAnsi="Courier New" w:cs="Courier New"/>
                 <w:shd w:val="clear" w:color="auto" w:fill="F2F2F2"/>
               </w:rPr>
-              <w:t>death_df$category</w:t>
-            </w:r>
-            <w:proofErr w:type="spellEnd"/>
-            <w:r>
-              <w:rPr>
-                <w:rFonts w:ascii="Courier New" w:eastAsia="Courier New" w:hAnsi="Courier New" w:cs="Courier New"/>
-                <w:shd w:val="clear" w:color="auto" w:fill="F2F2F2"/>
-              </w:rPr>
-              <w:t xml:space="preserve"> &lt;- </w:t>
-            </w:r>
-            <w:proofErr w:type="spellStart"/>
-            <w:proofErr w:type="gramStart"/>
-            <w:r>
-              <w:rPr>
-                <w:rFonts w:ascii="Courier New" w:eastAsia="Courier New" w:hAnsi="Courier New" w:cs="Courier New"/>
-                <w:shd w:val="clear" w:color="auto" w:fill="F2F2F2"/>
-              </w:rPr>
-              <w:t>as.factor</w:t>
-            </w:r>
-            <w:proofErr w:type="spellEnd"/>
-            <w:proofErr w:type="gramEnd"/>
-            <w:r>
-              <w:rPr>
-                <w:rFonts w:ascii="Courier New" w:eastAsia="Courier New" w:hAnsi="Courier New" w:cs="Courier New"/>
-                <w:shd w:val="clear" w:color="auto" w:fill="F2F2F2"/>
-              </w:rPr>
-              <w:t>(</w:t>
-            </w:r>
-            <w:proofErr w:type="spellStart"/>
-            <w:r>
-              <w:rPr>
-                <w:rFonts w:ascii="Courier New" w:eastAsia="Courier New" w:hAnsi="Courier New" w:cs="Courier New"/>
-                <w:shd w:val="clear" w:color="auto" w:fill="F2F2F2"/>
-              </w:rPr>
-              <w:t>death_df$category</w:t>
-            </w:r>
-            <w:proofErr w:type="spellEnd"/>
-            <w:r>
-              <w:rPr>
-                <w:rFonts w:ascii="Courier New" w:eastAsia="Courier New" w:hAnsi="Courier New" w:cs="Courier New"/>
-                <w:shd w:val="clear" w:color="auto" w:fill="F2F2F2"/>
-              </w:rPr>
-              <w:t>)</w:t>
+              <w:t>death_df$category &lt;- as.factor(death_df$category)</w:t>
             </w:r>
           </w:p>
         </w:tc>
@@ -3279,31 +3093,7 @@
         <w:rPr>
           <w:rFonts w:ascii="Times New Roman" w:hAnsi="Times New Roman" w:cs="Times New Roman"/>
         </w:rPr>
-        <w:t xml:space="preserve">You can </w:t>
-      </w:r>
-      <w:r>
-        <w:rPr>
-          <w:rFonts w:ascii="Times New Roman" w:hAnsi="Times New Roman" w:cs="Times New Roman"/>
-        </w:rPr>
-        <w:t xml:space="preserve">examine the structure of the new data frame object and </w:t>
-      </w:r>
-      <w:r>
-        <w:rPr>
-          <w:rFonts w:ascii="Times New Roman" w:hAnsi="Times New Roman" w:cs="Times New Roman"/>
-        </w:rPr>
-        <w:t xml:space="preserve">view </w:t>
-      </w:r>
-      <w:r>
-        <w:rPr>
-          <w:rFonts w:ascii="Times New Roman" w:hAnsi="Times New Roman" w:cs="Times New Roman"/>
-        </w:rPr>
-        <w:t>it</w:t>
-      </w:r>
-      <w:r>
-        <w:rPr>
-          <w:rFonts w:ascii="Times New Roman" w:hAnsi="Times New Roman" w:cs="Times New Roman"/>
-        </w:rPr>
-        <w:t xml:space="preserve"> by running:</w:t>
+        <w:t>You can examine the structure of the new data frame object and view it by running:</w:t>
       </w:r>
     </w:p>
     <w:tbl>
@@ -3341,23 +3131,14 @@
                 <w:rFonts w:ascii="Courier New" w:eastAsia="Courier New" w:hAnsi="Courier New" w:cs="Courier New"/>
                 <w:shd w:val="clear" w:color="auto" w:fill="F2F2F2"/>
               </w:rPr>
-              <w:t>Str(</w:t>
+              <w:t>s</w:t>
             </w:r>
-            <w:proofErr w:type="spellStart"/>
             <w:r>
               <w:rPr>
                 <w:rFonts w:ascii="Courier New" w:eastAsia="Courier New" w:hAnsi="Courier New" w:cs="Courier New"/>
                 <w:shd w:val="clear" w:color="auto" w:fill="F2F2F2"/>
               </w:rPr>
-              <w:t>death_df</w:t>
-            </w:r>
-            <w:proofErr w:type="spellEnd"/>
-            <w:r>
-              <w:rPr>
-                <w:rFonts w:ascii="Courier New" w:eastAsia="Courier New" w:hAnsi="Courier New" w:cs="Courier New"/>
-                <w:shd w:val="clear" w:color="auto" w:fill="F2F2F2"/>
-              </w:rPr>
-              <w:t>)</w:t>
+              <w:t>tr(death_df)</w:t>
             </w:r>
           </w:p>
           <w:p>
@@ -3384,23 +3165,7 @@
                 <w:rFonts w:ascii="Courier New" w:eastAsia="Courier New" w:hAnsi="Courier New" w:cs="Courier New"/>
                 <w:shd w:val="clear" w:color="auto" w:fill="F2F2F2"/>
               </w:rPr>
-              <w:t>View(</w:t>
-            </w:r>
-            <w:proofErr w:type="spellStart"/>
-            <w:r>
-              <w:rPr>
-                <w:rFonts w:ascii="Courier New" w:eastAsia="Courier New" w:hAnsi="Courier New" w:cs="Courier New"/>
-                <w:shd w:val="clear" w:color="auto" w:fill="F2F2F2"/>
-              </w:rPr>
-              <w:t>death_df</w:t>
-            </w:r>
-            <w:proofErr w:type="spellEnd"/>
-            <w:r>
-              <w:rPr>
-                <w:rFonts w:ascii="Courier New" w:eastAsia="Courier New" w:hAnsi="Courier New" w:cs="Courier New"/>
-                <w:shd w:val="clear" w:color="auto" w:fill="F2F2F2"/>
-              </w:rPr>
-              <w:t>)</w:t>
+              <w:t>View(death_df)</w:t>
             </w:r>
           </w:p>
         </w:tc>
@@ -3428,7 +3193,6 @@
         </w:rPr>
         <w:t xml:space="preserve">Using the </w:t>
       </w:r>
-      <w:proofErr w:type="spellStart"/>
       <w:r>
         <w:rPr>
           <w:rFonts w:ascii="Courier New" w:eastAsia="Courier New" w:hAnsi="Courier New" w:cs="Courier New"/>
@@ -3438,7 +3202,6 @@
         </w:rPr>
         <w:t>independentSamplesTTest</w:t>
       </w:r>
-      <w:proofErr w:type="spellEnd"/>
       <w:r>
         <w:rPr>
           <w:rFonts w:ascii="Times New Roman" w:eastAsia="Times New Roman" w:hAnsi="Times New Roman" w:cs="Times New Roman"/>
@@ -3455,9 +3218,8 @@
           <w:sz w:val="24"/>
           <w:szCs w:val="24"/>
         </w:rPr>
-        <w:t xml:space="preserve"> from the </w:t>
-      </w:r>
-      <w:proofErr w:type="spellStart"/>
+        <w:t xml:space="preserve"> from the lsr package</w:t>
+      </w:r>
       <w:r>
         <w:rPr>
           <w:rFonts w:ascii="Times New Roman" w:eastAsia="Times New Roman" w:hAnsi="Times New Roman" w:cs="Times New Roman"/>
@@ -3465,9 +3227,8 @@
           <w:sz w:val="24"/>
           <w:szCs w:val="24"/>
         </w:rPr>
-        <w:t>lsr</w:t>
-      </w:r>
-      <w:proofErr w:type="spellEnd"/>
+        <w:t>, run an independent samples t-test</w:t>
+      </w:r>
       <w:r>
         <w:rPr>
           <w:rFonts w:ascii="Times New Roman" w:eastAsia="Times New Roman" w:hAnsi="Times New Roman" w:cs="Times New Roman"/>
@@ -3475,7 +3236,7 @@
           <w:sz w:val="24"/>
           <w:szCs w:val="24"/>
         </w:rPr>
-        <w:t xml:space="preserve"> package</w:t>
+        <w:t xml:space="preserve"> to test the hypothesis that the average lifespan is different between two groups</w:t>
       </w:r>
       <w:r>
         <w:rPr>
@@ -3484,15 +3245,6 @@
           <w:sz w:val="24"/>
           <w:szCs w:val="24"/>
         </w:rPr>
-        <w:t>, run an independent samples t-test</w:t>
-      </w:r>
-      <w:r>
-        <w:rPr>
-          <w:rFonts w:ascii="Times New Roman" w:eastAsia="Times New Roman" w:hAnsi="Times New Roman" w:cs="Times New Roman"/>
-          <w:color w:val="000000"/>
-          <w:sz w:val="24"/>
-          <w:szCs w:val="24"/>
-        </w:rPr>
         <w:t xml:space="preserve">, and </w:t>
       </w:r>
       <w:r>
@@ -3635,7 +3387,7 @@
           <w:szCs w:val="24"/>
         </w:rPr>
         <w:lastRenderedPageBreak/>
-        <w:t>Part I</w:t>
+        <w:t>Part IV</w:t>
       </w:r>
       <w:r>
         <w:rPr>
@@ -3645,7 +3397,7 @@
           <w:sz w:val="24"/>
           <w:szCs w:val="24"/>
         </w:rPr>
-        <w:t>V</w:t>
+        <w:t xml:space="preserve"> (15 pts)</w:t>
       </w:r>
       <w:r>
         <w:rPr>
@@ -3655,16 +3407,6 @@
           <w:sz w:val="24"/>
           <w:szCs w:val="24"/>
         </w:rPr>
-        <w:t xml:space="preserve"> (15 pts)</w:t>
-      </w:r>
-      <w:r>
-        <w:rPr>
-          <w:rFonts w:ascii="Times New Roman" w:eastAsia="Times New Roman" w:hAnsi="Times New Roman" w:cs="Times New Roman"/>
-          <w:b/>
-          <w:bCs/>
-          <w:sz w:val="24"/>
-          <w:szCs w:val="24"/>
-        </w:rPr>
         <w:t>. Understanding the data structure for a dependent samples t-test</w:t>
       </w:r>
     </w:p>
@@ -3685,11 +3427,9 @@
       <w:r>
         <w:t xml:space="preserve"> influences a person’s ability to solve </w:t>
       </w:r>
-      <w:proofErr w:type="gramStart"/>
-      <w:r>
-        <w:t>statistics</w:t>
-      </w:r>
-      <w:proofErr w:type="gramEnd"/>
+      <w:r>
+        <w:t>statistical</w:t>
+      </w:r>
       <w:r>
         <w:t xml:space="preserve"> problems. Ten students are randomly selected and each student experiences </w:t>
       </w:r>
@@ -3738,13 +3478,7 @@
         <w:t>quiet environment</w:t>
       </w:r>
       <w:r>
-        <w:t xml:space="preserve">. Each condition lasts 10 minutes. During that time, students solve a set of </w:t>
-      </w:r>
-      <w:r>
-        <w:t>statistical</w:t>
-      </w:r>
-      <w:r>
-        <w:t xml:space="preserve"> problems, and the researcher records the </w:t>
+        <w:t xml:space="preserve">. Each condition lasts 10 minutes. During that time, students solve a set of statistical problems, and the researcher records the </w:t>
       </w:r>
       <w:r>
         <w:rPr>
@@ -3755,17 +3489,13 @@
         <w:t>number of mistakes</w:t>
       </w:r>
       <w:r>
-        <w:t xml:space="preserve"> each student makes in each </w:t>
-      </w:r>
-      <w:proofErr w:type="spellStart"/>
-      <w:proofErr w:type="gramStart"/>
-      <w:r>
-        <w:t>condition.The</w:t>
-      </w:r>
-      <w:proofErr w:type="spellEnd"/>
-      <w:proofErr w:type="gramEnd"/>
-      <w:r>
-        <w:t xml:space="preserve"> goal is to determine whether there is a </w:t>
+        <w:t xml:space="preserve"> each student makes in each condition.</w:t>
+      </w:r>
+      <w:r>
+        <w:t xml:space="preserve"> </w:t>
+      </w:r>
+      <w:r>
+        <w:t xml:space="preserve">The goal is to determine whether there is a </w:t>
       </w:r>
       <w:r>
         <w:rPr>
@@ -4425,23 +4155,7 @@
                 <w:rFonts w:ascii="Courier New" w:eastAsia="Courier New" w:hAnsi="Courier New" w:cs="Courier New"/>
                 <w:shd w:val="clear" w:color="auto" w:fill="F2F2F2"/>
               </w:rPr>
-              <w:t xml:space="preserve">silent &lt;- </w:t>
-            </w:r>
-            <w:proofErr w:type="gramStart"/>
-            <w:r>
-              <w:rPr>
-                <w:rFonts w:ascii="Courier New" w:eastAsia="Courier New" w:hAnsi="Courier New" w:cs="Courier New"/>
-                <w:shd w:val="clear" w:color="auto" w:fill="F2F2F2"/>
-              </w:rPr>
-              <w:t>c(</w:t>
-            </w:r>
-            <w:proofErr w:type="gramEnd"/>
-            <w:r>
-              <w:rPr>
-                <w:rFonts w:ascii="Courier New" w:eastAsia="Courier New" w:hAnsi="Courier New" w:cs="Courier New"/>
-                <w:shd w:val="clear" w:color="auto" w:fill="F2F2F2"/>
-              </w:rPr>
-              <w:t>6, 7, 7, 5, 4, 4, 6, 9, 5, 7)</w:t>
+              <w:t>silent &lt;- c(6, 7, 7, 5, 4, 4, 6, 9, 5, 7)</w:t>
             </w:r>
           </w:p>
           <w:p>
@@ -4458,23 +4172,7 @@
                 <w:rFonts w:ascii="Courier New" w:eastAsia="Courier New" w:hAnsi="Courier New" w:cs="Courier New"/>
                 <w:shd w:val="clear" w:color="auto" w:fill="F2F2F2"/>
               </w:rPr>
-              <w:t>noisy &lt;</w:t>
-            </w:r>
-            <w:proofErr w:type="gramStart"/>
-            <w:r>
-              <w:rPr>
-                <w:rFonts w:ascii="Courier New" w:eastAsia="Courier New" w:hAnsi="Courier New" w:cs="Courier New"/>
-                <w:shd w:val="clear" w:color="auto" w:fill="F2F2F2"/>
-              </w:rPr>
-              <w:t>-  c</w:t>
-            </w:r>
-            <w:proofErr w:type="gramEnd"/>
-            <w:r>
-              <w:rPr>
-                <w:rFonts w:ascii="Courier New" w:eastAsia="Courier New" w:hAnsi="Courier New" w:cs="Courier New"/>
-                <w:shd w:val="clear" w:color="auto" w:fill="F2F2F2"/>
-              </w:rPr>
-              <w:t>(9, 9, 6, 7, 6, 7, 9, 11, 7, 9)</w:t>
+              <w:t>noisy &lt;-  c(9, 9, 6, 7, 6, 7, 9, 11, 7, 9)</w:t>
             </w:r>
           </w:p>
           <w:p>
@@ -4486,39 +4184,12 @@
                 <w:shd w:val="clear" w:color="auto" w:fill="F2F2F2"/>
               </w:rPr>
             </w:pPr>
-            <w:proofErr w:type="spellStart"/>
             <w:r>
               <w:rPr>
                 <w:rFonts w:ascii="Courier New" w:eastAsia="Courier New" w:hAnsi="Courier New" w:cs="Courier New"/>
                 <w:shd w:val="clear" w:color="auto" w:fill="F2F2F2"/>
               </w:rPr>
-              <w:t>mistakes_df</w:t>
-            </w:r>
-            <w:proofErr w:type="spellEnd"/>
-            <w:r>
-              <w:rPr>
-                <w:rFonts w:ascii="Courier New" w:eastAsia="Courier New" w:hAnsi="Courier New" w:cs="Courier New"/>
-                <w:shd w:val="clear" w:color="auto" w:fill="F2F2F2"/>
-              </w:rPr>
-              <w:t xml:space="preserve"> &lt;- </w:t>
-            </w:r>
-            <w:proofErr w:type="spellStart"/>
-            <w:proofErr w:type="gramStart"/>
-            <w:r>
-              <w:rPr>
-                <w:rFonts w:ascii="Courier New" w:eastAsia="Courier New" w:hAnsi="Courier New" w:cs="Courier New"/>
-                <w:shd w:val="clear" w:color="auto" w:fill="F2F2F2"/>
-              </w:rPr>
-              <w:t>data.frame</w:t>
-            </w:r>
-            <w:proofErr w:type="spellEnd"/>
-            <w:proofErr w:type="gramEnd"/>
-            <w:r>
-              <w:rPr>
-                <w:rFonts w:ascii="Courier New" w:eastAsia="Courier New" w:hAnsi="Courier New" w:cs="Courier New"/>
-                <w:shd w:val="clear" w:color="auto" w:fill="F2F2F2"/>
-              </w:rPr>
-              <w:t>(silent, noisy)</w:t>
+              <w:t>mistakes_df &lt;- data.frame(silent, noisy)</w:t>
             </w:r>
           </w:p>
           <w:p>
@@ -4543,23 +4214,7 @@
                 <w:rFonts w:ascii="Courier New" w:eastAsia="Courier New" w:hAnsi="Courier New" w:cs="Courier New"/>
                 <w:shd w:val="clear" w:color="auto" w:fill="F2F2F2"/>
               </w:rPr>
-              <w:t>View(</w:t>
-            </w:r>
-            <w:proofErr w:type="spellStart"/>
-            <w:r>
-              <w:rPr>
-                <w:rFonts w:ascii="Courier New" w:eastAsia="Courier New" w:hAnsi="Courier New" w:cs="Courier New"/>
-                <w:shd w:val="clear" w:color="auto" w:fill="F2F2F2"/>
-              </w:rPr>
-              <w:t>mistakes_df</w:t>
-            </w:r>
-            <w:proofErr w:type="spellEnd"/>
-            <w:r>
-              <w:rPr>
-                <w:rFonts w:ascii="Courier New" w:eastAsia="Courier New" w:hAnsi="Courier New" w:cs="Courier New"/>
-                <w:shd w:val="clear" w:color="auto" w:fill="F2F2F2"/>
-              </w:rPr>
-              <w:t>)</w:t>
+              <w:t>View(mistakes_df)</w:t>
             </w:r>
           </w:p>
         </w:tc>
@@ -4587,7 +4242,6 @@
         </w:rPr>
         <w:t xml:space="preserve">Using the </w:t>
       </w:r>
-      <w:proofErr w:type="spellStart"/>
       <w:r>
         <w:rPr>
           <w:rFonts w:ascii="Courier New" w:eastAsia="Courier New" w:hAnsi="Courier New" w:cs="Courier New"/>
@@ -4597,7 +4251,6 @@
         </w:rPr>
         <w:t>oneSampleTTest</w:t>
       </w:r>
-      <w:proofErr w:type="spellEnd"/>
       <w:r>
         <w:rPr>
           <w:rFonts w:ascii="Times New Roman" w:hAnsi="Times New Roman" w:cs="Times New Roman"/>
@@ -4608,21 +4261,7 @@
         <w:rPr>
           <w:rFonts w:ascii="Times New Roman" w:hAnsi="Times New Roman" w:cs="Times New Roman"/>
         </w:rPr>
-        <w:t xml:space="preserve">the </w:t>
-      </w:r>
-      <w:proofErr w:type="spellStart"/>
-      <w:r>
-        <w:rPr>
-          <w:rFonts w:ascii="Times New Roman" w:hAnsi="Times New Roman" w:cs="Times New Roman"/>
-        </w:rPr>
-        <w:t>lsr</w:t>
-      </w:r>
-      <w:proofErr w:type="spellEnd"/>
-      <w:r>
-        <w:rPr>
-          <w:rFonts w:ascii="Times New Roman" w:hAnsi="Times New Roman" w:cs="Times New Roman"/>
-        </w:rPr>
-        <w:t xml:space="preserve"> package</w:t>
+        <w:t>the lsr package</w:t>
       </w:r>
       <w:r>
         <w:rPr>
@@ -4822,7 +4461,7 @@
           <w:szCs w:val="24"/>
         </w:rPr>
         <w:lastRenderedPageBreak/>
-        <w:t xml:space="preserve">Part </w:t>
+        <w:t>Part V</w:t>
       </w:r>
       <w:r>
         <w:rPr>
@@ -4832,7 +4471,7 @@
           <w:sz w:val="24"/>
           <w:szCs w:val="24"/>
         </w:rPr>
-        <w:t>V</w:t>
+        <w:t xml:space="preserve"> (20 pts)</w:t>
       </w:r>
       <w:r>
         <w:rPr>
@@ -4842,16 +4481,6 @@
           <w:sz w:val="24"/>
           <w:szCs w:val="24"/>
         </w:rPr>
-        <w:t xml:space="preserve"> (20 pts)</w:t>
-      </w:r>
-      <w:r>
-        <w:rPr>
-          <w:rFonts w:ascii="Times New Roman" w:eastAsia="Times New Roman" w:hAnsi="Times New Roman" w:cs="Times New Roman"/>
-          <w:b/>
-          <w:bCs/>
-          <w:sz w:val="24"/>
-          <w:szCs w:val="24"/>
-        </w:rPr>
         <w:t>. Conducting an independent samples t-test and writing up results</w:t>
       </w:r>
     </w:p>
@@ -4866,19 +4495,7 @@
         <w:rPr>
           <w:rFonts w:ascii="Times New Roman" w:hAnsi="Times New Roman" w:cs="Times New Roman"/>
         </w:rPr>
-        <w:t>For this part, you will use a</w:t>
-      </w:r>
-      <w:r>
-        <w:rPr>
-          <w:rFonts w:ascii="Times New Roman" w:hAnsi="Times New Roman" w:cs="Times New Roman"/>
-        </w:rPr>
-        <w:t>gain the</w:t>
-      </w:r>
-      <w:r>
-        <w:rPr>
-          <w:rFonts w:ascii="Times New Roman" w:hAnsi="Times New Roman" w:cs="Times New Roman"/>
-        </w:rPr>
-        <w:t xml:space="preserve"> </w:t>
+        <w:t xml:space="preserve">For this part, you will use again the </w:t>
       </w:r>
       <w:r>
         <w:rPr>
@@ -4896,33 +4513,11 @@
         </w:rPr>
         <w:t xml:space="preserve"> </w:t>
       </w:r>
-      <w:proofErr w:type="spellStart"/>
-      <w:proofErr w:type="gramStart"/>
-      <w:r>
-        <w:rPr>
-          <w:rFonts w:ascii="Times New Roman" w:hAnsi="Times New Roman" w:cs="Times New Roman"/>
-        </w:rPr>
-        <w:t>dataset</w:t>
-      </w:r>
-      <w:r>
-        <w:rPr>
-          <w:rFonts w:ascii="Times New Roman" w:hAnsi="Times New Roman" w:cs="Times New Roman"/>
-        </w:rPr>
-        <w:t>.</w:t>
-      </w:r>
-      <w:r>
-        <w:rPr>
-          <w:rFonts w:ascii="Times New Roman" w:hAnsi="Times New Roman" w:cs="Times New Roman"/>
-        </w:rPr>
-        <w:t>You</w:t>
-      </w:r>
-      <w:proofErr w:type="spellEnd"/>
-      <w:proofErr w:type="gramEnd"/>
-      <w:r>
-        <w:rPr>
-          <w:rFonts w:ascii="Times New Roman" w:hAnsi="Times New Roman" w:cs="Times New Roman"/>
-        </w:rPr>
-        <w:t xml:space="preserve"> are investigating the following research question:</w:t>
+      <w:r>
+        <w:rPr>
+          <w:rFonts w:ascii="Times New Roman" w:hAnsi="Times New Roman" w:cs="Times New Roman"/>
+        </w:rPr>
+        <w:t>dataset.You are investigating the following research question:</w:t>
       </w:r>
     </w:p>
     <w:p>
@@ -5042,23 +4637,21 @@
           <w:sz w:val="22"/>
           <w:szCs w:val="22"/>
         </w:rPr>
-        <w:t xml:space="preserve"> (1: Yes, </w:t>
-      </w:r>
-      <w:proofErr w:type="gramStart"/>
-      <w:r>
-        <w:rPr>
-          <w:sz w:val="22"/>
-          <w:szCs w:val="22"/>
-        </w:rPr>
-        <w:t>2:No</w:t>
-      </w:r>
-      <w:proofErr w:type="gramEnd"/>
-      <w:r>
-        <w:rPr>
-          <w:sz w:val="22"/>
-          <w:szCs w:val="22"/>
-        </w:rPr>
-        <w:t>)</w:t>
+        <w:t xml:space="preserve"> (1: Yes, 2:</w:t>
+      </w:r>
+      <w:r>
+        <w:rPr>
+          <w:sz w:val="22"/>
+          <w:szCs w:val="22"/>
+        </w:rPr>
+        <w:t xml:space="preserve"> </w:t>
+      </w:r>
+      <w:r>
+        <w:rPr>
+          <w:sz w:val="22"/>
+          <w:szCs w:val="22"/>
+        </w:rPr>
+        <w:t>No)</w:t>
       </w:r>
     </w:p>
     <w:p>
@@ -5229,51 +4822,7 @@
           <w:sz w:val="22"/>
           <w:szCs w:val="22"/>
         </w:rPr>
-        <w:t xml:space="preserve"> is a binary variable representing </w:t>
-      </w:r>
-      <w:proofErr w:type="gramStart"/>
-      <w:r>
-        <w:rPr>
-          <w:sz w:val="22"/>
-          <w:szCs w:val="22"/>
-        </w:rPr>
-        <w:t>whether or not</w:t>
-      </w:r>
-      <w:proofErr w:type="gramEnd"/>
-      <w:r>
-        <w:rPr>
-          <w:sz w:val="22"/>
-          <w:szCs w:val="22"/>
-        </w:rPr>
-        <w:t xml:space="preserve"> a kid is a </w:t>
-      </w:r>
-      <w:r>
-        <w:rPr>
-          <w:sz w:val="22"/>
-          <w:szCs w:val="22"/>
-        </w:rPr>
-        <w:t>first-time kindergartner</w:t>
-      </w:r>
-      <w:r>
-        <w:rPr>
-          <w:sz w:val="22"/>
-          <w:szCs w:val="22"/>
-        </w:rPr>
-        <w:t xml:space="preserve"> (1: Yes, 2: No), and t</w:t>
-      </w:r>
-      <w:r>
-        <w:rPr>
-          <w:sz w:val="22"/>
-          <w:szCs w:val="22"/>
-        </w:rPr>
-        <w:t xml:space="preserve">he values </w:t>
-      </w:r>
-      <w:r>
-        <w:rPr>
-          <w:sz w:val="22"/>
-          <w:szCs w:val="22"/>
-        </w:rPr>
-        <w:t xml:space="preserve">of </w:t>
+        <w:t xml:space="preserve"> is a binary variable representing whether or not a kid is a first-time kindergartner (1: Yes, 2: No), and the values of </w:t>
       </w:r>
       <w:r>
         <w:rPr>
@@ -5288,21 +4837,7 @@
           <w:sz w:val="22"/>
           <w:szCs w:val="22"/>
         </w:rPr>
-        <w:t xml:space="preserve"> represent missing data.</w:t>
-      </w:r>
-      <w:r>
-        <w:rPr>
-          <w:sz w:val="22"/>
-          <w:szCs w:val="22"/>
-        </w:rPr>
-        <w:t xml:space="preserve"> </w:t>
-      </w:r>
-      <w:r>
-        <w:rPr>
-          <w:sz w:val="22"/>
-          <w:szCs w:val="22"/>
-        </w:rPr>
-        <w:t xml:space="preserve">Recode these missing values to </w:t>
+        <w:t xml:space="preserve"> represent missing data. Recode these missing values to </w:t>
       </w:r>
       <w:r>
         <w:rPr>
@@ -5359,14 +4894,7 @@
           <w:sz w:val="22"/>
           <w:szCs w:val="22"/>
         </w:rPr>
-        <w:t xml:space="preserve"> </w:t>
-      </w:r>
-      <w:r>
-        <w:rPr>
-          <w:sz w:val="22"/>
-          <w:szCs w:val="22"/>
-        </w:rPr>
-        <w:t xml:space="preserve">variable into a </w:t>
+        <w:t xml:space="preserve"> variable into a </w:t>
       </w:r>
       <w:r>
         <w:rPr>
@@ -5376,37 +4904,15 @@
           <w:sz w:val="22"/>
           <w:szCs w:val="22"/>
         </w:rPr>
-        <w:t>factor</w:t>
+        <w:t xml:space="preserve">factor using the </w:t>
       </w:r>
       <w:r>
         <w:rPr>
           <w:rStyle w:val="Strong"/>
-          <w:b w:val="0"/>
-          <w:bCs w:val="0"/>
-          <w:sz w:val="22"/>
-          <w:szCs w:val="22"/>
-        </w:rPr>
-        <w:t xml:space="preserve"> using the </w:t>
-      </w:r>
-      <w:proofErr w:type="spellStart"/>
-      <w:proofErr w:type="gramStart"/>
-      <w:r>
-        <w:rPr>
-          <w:rStyle w:val="Strong"/>
-          <w:sz w:val="22"/>
-          <w:szCs w:val="22"/>
-        </w:rPr>
-        <w:t>as.factor</w:t>
-      </w:r>
-      <w:proofErr w:type="spellEnd"/>
-      <w:proofErr w:type="gramEnd"/>
-      <w:r>
-        <w:rPr>
-          <w:rStyle w:val="Strong"/>
-          <w:sz w:val="22"/>
-          <w:szCs w:val="22"/>
-        </w:rPr>
-        <w:t>()</w:t>
+          <w:sz w:val="22"/>
+          <w:szCs w:val="22"/>
+        </w:rPr>
+        <w:t>as.factor()</w:t>
       </w:r>
       <w:r>
         <w:rPr>
@@ -5692,16 +5198,7 @@
           <w:sz w:val="24"/>
           <w:szCs w:val="24"/>
         </w:rPr>
-        <w:t xml:space="preserve">Provide </w:t>
-      </w:r>
-      <w:r>
-        <w:rPr>
-          <w:rFonts w:ascii="Times New Roman" w:eastAsia="Times New Roman" w:hAnsi="Times New Roman" w:cs="Times New Roman"/>
-          <w:color w:val="000000"/>
-          <w:sz w:val="24"/>
-          <w:szCs w:val="24"/>
-        </w:rPr>
-        <w:t>a brief APA-style summary of your findings.</w:t>
+        <w:t>Provide a brief APA-style summary of your findings.</w:t>
       </w:r>
     </w:p>
     <w:p>
@@ -5800,27 +5297,7 @@
           <w:szCs w:val="24"/>
         </w:rPr>
         <w:lastRenderedPageBreak/>
-        <w:t>Part V</w:t>
-      </w:r>
-      <w:r>
-        <w:rPr>
-          <w:rFonts w:ascii="Times New Roman" w:eastAsia="Times New Roman" w:hAnsi="Times New Roman" w:cs="Times New Roman"/>
-          <w:b/>
-          <w:bCs/>
-          <w:sz w:val="24"/>
-          <w:szCs w:val="24"/>
-        </w:rPr>
-        <w:t>I (20 pts)</w:t>
-      </w:r>
-      <w:r>
-        <w:rPr>
-          <w:rFonts w:ascii="Times New Roman" w:eastAsia="Times New Roman" w:hAnsi="Times New Roman" w:cs="Times New Roman"/>
-          <w:b/>
-          <w:bCs/>
-          <w:sz w:val="24"/>
-          <w:szCs w:val="24"/>
-        </w:rPr>
-        <w:t>. Conducting a dependent samples t-test and writing up results</w:t>
+        <w:t>Part VI (20 pts). Conducting a dependent samples t-test and writing up results</w:t>
       </w:r>
     </w:p>
     <w:p>
@@ -6139,7 +5616,23 @@
           <w:sz w:val="22"/>
           <w:szCs w:val="22"/>
         </w:rPr>
-        <w:t>ATTNFS and ATTNFS</w:t>
+        <w:t xml:space="preserve">ATTNFS and </w:t>
+      </w:r>
+      <w:r>
+        <w:rPr>
+          <w:rStyle w:val="Strong"/>
+          <w:sz w:val="22"/>
+          <w:szCs w:val="22"/>
+        </w:rPr>
+        <w:t>X2</w:t>
+      </w:r>
+      <w:r>
+        <w:rPr>
+          <w:rStyle w:val="Strong"/>
+          <w:sz w:val="22"/>
+          <w:szCs w:val="22"/>
+        </w:rPr>
+        <w:t>ATTNFS</w:t>
       </w:r>
       <w:r>
         <w:rPr>
@@ -6538,6 +6031,7 @@
       </w:pPr>
     </w:p>
     <w:sectPr>
+      <w:footerReference w:type="default" r:id="rId9"/>
       <w:pgSz w:w="12240" w:h="15840"/>
       <w:pgMar w:top="1440" w:right="1440" w:bottom="1440" w:left="1440" w:header="720" w:footer="720" w:gutter="0"/>
       <w:pgNumType w:start="1"/>
@@ -6547,6 +6041,109 @@
 </w:document>
 </file>
 
+<file path=word/endnotes.xml><?xml version="1.0" encoding="utf-8"?>
+<w:endnotes xmlns:wpc="http://schemas.microsoft.com/office/word/2010/wordprocessingCanvas" xmlns:cx="http://schemas.microsoft.com/office/drawing/2014/chartex" xmlns:cx1="http://schemas.microsoft.com/office/drawing/2015/9/8/chartex" xmlns:cx2="http://schemas.microsoft.com/office/drawing/2015/10/21/chartex" xmlns:cx3="http://schemas.microsoft.com/office/drawing/2016/5/9/chartex" xmlns:cx4="http://schemas.microsoft.com/office/drawing/2016/5/10/chartex" xmlns:cx5="http://schemas.microsoft.com/office/drawing/2016/5/11/chartex" xmlns:cx6="http://schemas.microsoft.com/office/drawing/2016/5/12/chartex" xmlns:cx7="http://schemas.microsoft.com/office/drawing/2016/5/13/chartex" xmlns:cx8="http://schemas.microsoft.com/office/drawing/2016/5/14/chartex" xmlns:mc="http://schemas.openxmlformats.org/markup-compatibility/2006" xmlns:aink="http://schemas.microsoft.com/office/drawing/2016/ink" xmlns:am3d="http://schemas.microsoft.com/office/drawing/2017/model3d" xmlns:o="urn:schemas-microsoft-com:office:office" xmlns:oel="http://schemas.microsoft.com/office/2019/extlst" xmlns:r="http://schemas.openxmlformats.org/officeDocument/2006/relationships" xmlns:m="http://schemas.openxmlformats.org/officeDocument/2006/math" xmlns:v="urn:schemas-microsoft-com:vml" xmlns:wp14="http://schemas.microsoft.com/office/word/2010/wordprocessingDrawing" xmlns:wp="http://schemas.openxmlformats.org/drawingml/2006/wordprocessingDrawing" xmlns:w10="urn:schemas-microsoft-com:office:word" xmlns:w="http://schemas.openxmlformats.org/wordprocessingml/2006/main" xmlns:w14="http://schemas.microsoft.com/office/word/2010/wordml" xmlns:w15="http://schemas.microsoft.com/office/word/2012/wordml" xmlns:w16cex="http://schemas.microsoft.com/office/word/2018/wordml/cex" xmlns:w16cid="http://schemas.microsoft.com/office/word/2016/wordml/cid" xmlns:w16="http://schemas.microsoft.com/office/word/2018/wordml" xmlns:w16du="http://schemas.microsoft.com/office/word/2023/wordml/word16du" xmlns:w16sdtdh="http://schemas.microsoft.com/office/word/2020/wordml/sdtdatahash" xmlns:w16sdtfl="http://schemas.microsoft.com/office/word/2024/wordml/sdtformatlock" xmlns:w16se="http://schemas.microsoft.com/office/word/2015/wordml/symex" xmlns:wpg="http://schemas.microsoft.com/office/word/2010/wordprocessingGroup" xmlns:wpi="http://schemas.microsoft.com/office/word/2010/wordprocessingInk" xmlns:wne="http://schemas.microsoft.com/office/word/2006/wordml" xmlns:wps="http://schemas.microsoft.com/office/word/2010/wordprocessingShape" mc:Ignorable="w14 w15 w16se w16cid w16 w16cex w16sdtdh w16sdtfl w16du wp14">
+  <w:endnote w:type="separator" w:id="-1">
+    <w:p>
+      <w:pPr>
+        <w:spacing w:line="240" w:lineRule="auto"/>
+      </w:pPr>
+      <w:r>
+        <w:separator/>
+      </w:r>
+    </w:p>
+  </w:endnote>
+  <w:endnote w:type="continuationSeparator" w:id="0">
+    <w:p>
+      <w:pPr>
+        <w:spacing w:line="240" w:lineRule="auto"/>
+      </w:pPr>
+      <w:r>
+        <w:continuationSeparator/>
+      </w:r>
+    </w:p>
+  </w:endnote>
+</w:endnotes>
+</file>
+
+<file path=word/footer1.xml><?xml version="1.0" encoding="utf-8"?>
+<w:ftr xmlns:wpc="http://schemas.microsoft.com/office/word/2010/wordprocessingCanvas" xmlns:cx="http://schemas.microsoft.com/office/drawing/2014/chartex" xmlns:cx1="http://schemas.microsoft.com/office/drawing/2015/9/8/chartex" xmlns:cx2="http://schemas.microsoft.com/office/drawing/2015/10/21/chartex" xmlns:cx3="http://schemas.microsoft.com/office/drawing/2016/5/9/chartex" xmlns:cx4="http://schemas.microsoft.com/office/drawing/2016/5/10/chartex" xmlns:cx5="http://schemas.microsoft.com/office/drawing/2016/5/11/chartex" xmlns:cx6="http://schemas.microsoft.com/office/drawing/2016/5/12/chartex" xmlns:cx7="http://schemas.microsoft.com/office/drawing/2016/5/13/chartex" xmlns:cx8="http://schemas.microsoft.com/office/drawing/2016/5/14/chartex" xmlns:mc="http://schemas.openxmlformats.org/markup-compatibility/2006" xmlns:aink="http://schemas.microsoft.com/office/drawing/2016/ink" xmlns:am3d="http://schemas.microsoft.com/office/drawing/2017/model3d" xmlns:o="urn:schemas-microsoft-com:office:office" xmlns:oel="http://schemas.microsoft.com/office/2019/extlst" xmlns:r="http://schemas.openxmlformats.org/officeDocument/2006/relationships" xmlns:m="http://schemas.openxmlformats.org/officeDocument/2006/math" xmlns:v="urn:schemas-microsoft-com:vml" xmlns:wp14="http://schemas.microsoft.com/office/word/2010/wordprocessingDrawing" xmlns:wp="http://schemas.openxmlformats.org/drawingml/2006/wordprocessingDrawing" xmlns:w10="urn:schemas-microsoft-com:office:word" xmlns:w="http://schemas.openxmlformats.org/wordprocessingml/2006/main" xmlns:w14="http://schemas.microsoft.com/office/word/2010/wordml" xmlns:w15="http://schemas.microsoft.com/office/word/2012/wordml" xmlns:w16cex="http://schemas.microsoft.com/office/word/2018/wordml/cex" xmlns:w16cid="http://schemas.microsoft.com/office/word/2016/wordml/cid" xmlns:w16="http://schemas.microsoft.com/office/word/2018/wordml" xmlns:w16du="http://schemas.microsoft.com/office/word/2023/wordml/word16du" xmlns:w16sdtdh="http://schemas.microsoft.com/office/word/2020/wordml/sdtdatahash" xmlns:w16sdtfl="http://schemas.microsoft.com/office/word/2024/wordml/sdtformatlock" xmlns:w16se="http://schemas.microsoft.com/office/word/2015/wordml/symex" xmlns:wpg="http://schemas.microsoft.com/office/word/2010/wordprocessingGroup" xmlns:wpi="http://schemas.microsoft.com/office/word/2010/wordprocessingInk" xmlns:wne="http://schemas.microsoft.com/office/word/2006/wordml" xmlns:wps="http://schemas.microsoft.com/office/word/2010/wordprocessingShape" mc:Ignorable="w14 w15 w16se w16cid w16 w16cex w16sdtdh w16sdtfl w16du wp14">
+  <w:sdt>
+    <w:sdtPr>
+      <w:id w:val="556590578"/>
+      <w:docPartObj>
+        <w:docPartGallery w:val="Page Numbers (Bottom of Page)"/>
+        <w:docPartUnique/>
+      </w:docPartObj>
+    </w:sdtPr>
+    <w:sdtEndPr>
+      <w:rPr>
+        <w:noProof/>
+      </w:rPr>
+    </w:sdtEndPr>
+    <w:sdtContent>
+      <w:p>
+        <w:pPr>
+          <w:pStyle w:val="Footer"/>
+          <w:jc w:val="right"/>
+        </w:pPr>
+        <w:r>
+          <w:fldChar w:fldCharType="begin"/>
+        </w:r>
+        <w:r>
+          <w:instrText xml:space="preserve"> PAGE   \* MERGEFORMAT </w:instrText>
+        </w:r>
+        <w:r>
+          <w:fldChar w:fldCharType="separate"/>
+        </w:r>
+        <w:r>
+          <w:rPr>
+            <w:noProof/>
+          </w:rPr>
+          <w:t>2</w:t>
+        </w:r>
+        <w:r>
+          <w:rPr>
+            <w:noProof/>
+          </w:rPr>
+          <w:fldChar w:fldCharType="end"/>
+        </w:r>
+      </w:p>
+    </w:sdtContent>
+  </w:sdt>
+  <w:p>
+    <w:pPr>
+      <w:pStyle w:val="Footer"/>
+    </w:pPr>
+  </w:p>
+</w:ftr>
+</file>
+
+<file path=word/footnotes.xml><?xml version="1.0" encoding="utf-8"?>
+<w:footnotes xmlns:wpc="http://schemas.microsoft.com/office/word/2010/wordprocessingCanvas" xmlns:cx="http://schemas.microsoft.com/office/drawing/2014/chartex" xmlns:cx1="http://schemas.microsoft.com/office/drawing/2015/9/8/chartex" xmlns:cx2="http://schemas.microsoft.com/office/drawing/2015/10/21/chartex" xmlns:cx3="http://schemas.microsoft.com/office/drawing/2016/5/9/chartex" xmlns:cx4="http://schemas.microsoft.com/office/drawing/2016/5/10/chartex" xmlns:cx5="http://schemas.microsoft.com/office/drawing/2016/5/11/chartex" xmlns:cx6="http://schemas.microsoft.com/office/drawing/2016/5/12/chartex" xmlns:cx7="http://schemas.microsoft.com/office/drawing/2016/5/13/chartex" xmlns:cx8="http://schemas.microsoft.com/office/drawing/2016/5/14/chartex" xmlns:mc="http://schemas.openxmlformats.org/markup-compatibility/2006" xmlns:aink="http://schemas.microsoft.com/office/drawing/2016/ink" xmlns:am3d="http://schemas.microsoft.com/office/drawing/2017/model3d" xmlns:o="urn:schemas-microsoft-com:office:office" xmlns:oel="http://schemas.microsoft.com/office/2019/extlst" xmlns:r="http://schemas.openxmlformats.org/officeDocument/2006/relationships" xmlns:m="http://schemas.openxmlformats.org/officeDocument/2006/math" xmlns:v="urn:schemas-microsoft-com:vml" xmlns:wp14="http://schemas.microsoft.com/office/word/2010/wordprocessingDrawing" xmlns:wp="http://schemas.openxmlformats.org/drawingml/2006/wordprocessingDrawing" xmlns:w10="urn:schemas-microsoft-com:office:word" xmlns:w="http://schemas.openxmlformats.org/wordprocessingml/2006/main" xmlns:w14="http://schemas.microsoft.com/office/word/2010/wordml" xmlns:w15="http://schemas.microsoft.com/office/word/2012/wordml" xmlns:w16cex="http://schemas.microsoft.com/office/word/2018/wordml/cex" xmlns:w16cid="http://schemas.microsoft.com/office/word/2016/wordml/cid" xmlns:w16="http://schemas.microsoft.com/office/word/2018/wordml" xmlns:w16du="http://schemas.microsoft.com/office/word/2023/wordml/word16du" xmlns:w16sdtdh="http://schemas.microsoft.com/office/word/2020/wordml/sdtdatahash" xmlns:w16sdtfl="http://schemas.microsoft.com/office/word/2024/wordml/sdtformatlock" xmlns:w16se="http://schemas.microsoft.com/office/word/2015/wordml/symex" xmlns:wpg="http://schemas.microsoft.com/office/word/2010/wordprocessingGroup" xmlns:wpi="http://schemas.microsoft.com/office/word/2010/wordprocessingInk" xmlns:wne="http://schemas.microsoft.com/office/word/2006/wordml" xmlns:wps="http://schemas.microsoft.com/office/word/2010/wordprocessingShape" mc:Ignorable="w14 w15 w16se w16cid w16 w16cex w16sdtdh w16sdtfl w16du wp14">
+  <w:footnote w:type="separator" w:id="-1">
+    <w:p>
+      <w:pPr>
+        <w:spacing w:line="240" w:lineRule="auto"/>
+      </w:pPr>
+      <w:r>
+        <w:separator/>
+      </w:r>
+    </w:p>
+  </w:footnote>
+  <w:footnote w:type="continuationSeparator" w:id="0">
+    <w:p>
+      <w:pPr>
+        <w:spacing w:line="240" w:lineRule="auto"/>
+      </w:pPr>
+      <w:r>
+        <w:continuationSeparator/>
+      </w:r>
+    </w:p>
+  </w:footnote>
+</w:footnotes>
+</file>
+
 <file path=word/numbering.xml><?xml version="1.0" encoding="utf-8"?>
 <w:numbering xmlns:wpc="http://schemas.microsoft.com/office/word/2010/wordprocessingCanvas" xmlns:cx="http://schemas.microsoft.com/office/drawing/2014/chartex" xmlns:cx1="http://schemas.microsoft.com/office/drawing/2015/9/8/chartex" xmlns:cx2="http://schemas.microsoft.com/office/drawing/2015/10/21/chartex" xmlns:cx3="http://schemas.microsoft.com/office/drawing/2016/5/9/chartex" xmlns:cx4="http://schemas.microsoft.com/office/drawing/2016/5/10/chartex" xmlns:cx5="http://schemas.microsoft.com/office/drawing/2016/5/11/chartex" xmlns:cx6="http://schemas.microsoft.com/office/drawing/2016/5/12/chartex" xmlns:cx7="http://schemas.microsoft.com/office/drawing/2016/5/13/chartex" xmlns:cx8="http://schemas.microsoft.com/office/drawing/2016/5/14/chartex" xmlns:mc="http://schemas.openxmlformats.org/markup-compatibility/2006" xmlns:aink="http://schemas.microsoft.com/office/drawing/2016/ink" xmlns:am3d="http://schemas.microsoft.com/office/drawing/2017/model3d" xmlns:o="urn:schemas-microsoft-com:office:office" xmlns:oel="http://schemas.microsoft.com/office/2019/extlst" xmlns:r="http://schemas.openxmlformats.org/officeDocument/2006/relationships" xmlns:m="http://schemas.openxmlformats.org/officeDocument/2006/math" xmlns:v="urn:schemas-microsoft-com:vml" xmlns:wp14="http://schemas.microsoft.com/office/word/2010/wordprocessingDrawing" xmlns:wp="http://schemas.openxmlformats.org/drawingml/2006/wordprocessingDrawing" xmlns:w10="urn:schemas-microsoft-com:office:word" xmlns:w="http://schemas.openxmlformats.org/wordprocessingml/2006/main" xmlns:w14="http://schemas.microsoft.com/office/word/2010/wordml" xmlns:w15="http://schemas.microsoft.com/office/word/2012/wordml" xmlns:w16cex="http://schemas.microsoft.com/office/word/2018/wordml/cex" xmlns:w16cid="http://schemas.microsoft.com/office/word/2016/wordml/cid" xmlns:w16="http://schemas.microsoft.com/office/word/2018/wordml" xmlns:w16du="http://schemas.microsoft.com/office/word/2023/wordml/word16du" xmlns:w16sdtdh="http://schemas.microsoft.com/office/word/2020/wordml/sdtdatahash" xmlns:w16sdtfl="http://schemas.microsoft.com/office/word/2024/wordml/sdtformatlock" xmlns:w16se="http://schemas.microsoft.com/office/word/2015/wordml/symex" xmlns:wpg="http://schemas.microsoft.com/office/word/2010/wordprocessingGroup" xmlns:wpi="http://schemas.microsoft.com/office/word/2010/wordprocessingInk" xmlns:wne="http://schemas.microsoft.com/office/word/2006/wordml" xmlns:wps="http://schemas.microsoft.com/office/word/2010/wordprocessingShape" mc:Ignorable="w14 w15 w16se w16cid w16 w16cex w16sdtdh w16sdtfl w16du wp14">
   <w:abstractNum w:abstractNumId="0" w15:restartNumberingAfterBreak="0">
@@ -6963,7 +6560,7 @@
   <w:abstractNum w:abstractNumId="3" w15:restartNumberingAfterBreak="0">
     <w:nsid w:val="1019458C"/>
     <w:multiLevelType w:val="multilevel"/>
-    <w:tmpl w:val="D4BE00A8"/>
+    <w:tmpl w:val="FC3E604C"/>
     <w:lvl w:ilvl="0">
       <w:start w:val="1"/>
       <w:numFmt w:val="lowerLetter"/>
@@ -7010,6 +6607,8 @@
       </w:pPr>
       <w:rPr>
         <w:rFonts w:ascii="Times New Roman" w:eastAsia="Times New Roman" w:hAnsi="Times New Roman" w:cs="Times New Roman"/>
+        <w:b w:val="0"/>
+        <w:bCs w:val="0"/>
       </w:rPr>
     </w:lvl>
     <w:lvl w:ilvl="4">
@@ -10807,6 +10406,50 @@
     <w:basedOn w:val="DefaultParagraphFont"/>
     <w:rsid w:val="00C773BE"/>
   </w:style>
+  <w:style w:type="paragraph" w:styleId="Header">
+    <w:name w:val="header"/>
+    <w:basedOn w:val="Normal"/>
+    <w:link w:val="HeaderChar"/>
+    <w:uiPriority w:val="99"/>
+    <w:unhideWhenUsed/>
+    <w:rsid w:val="008F7B2C"/>
+    <w:pPr>
+      <w:tabs>
+        <w:tab w:val="center" w:pos="4680"/>
+        <w:tab w:val="right" w:pos="9360"/>
+      </w:tabs>
+      <w:spacing w:line="240" w:lineRule="auto"/>
+    </w:pPr>
+  </w:style>
+  <w:style w:type="character" w:customStyle="1" w:styleId="HeaderChar">
+    <w:name w:val="Header Char"/>
+    <w:basedOn w:val="DefaultParagraphFont"/>
+    <w:link w:val="Header"/>
+    <w:uiPriority w:val="99"/>
+    <w:rsid w:val="008F7B2C"/>
+  </w:style>
+  <w:style w:type="paragraph" w:styleId="Footer">
+    <w:name w:val="footer"/>
+    <w:basedOn w:val="Normal"/>
+    <w:link w:val="FooterChar"/>
+    <w:uiPriority w:val="99"/>
+    <w:unhideWhenUsed/>
+    <w:rsid w:val="008F7B2C"/>
+    <w:pPr>
+      <w:tabs>
+        <w:tab w:val="center" w:pos="4680"/>
+        <w:tab w:val="right" w:pos="9360"/>
+      </w:tabs>
+      <w:spacing w:line="240" w:lineRule="auto"/>
+    </w:pPr>
+  </w:style>
+  <w:style w:type="character" w:customStyle="1" w:styleId="FooterChar">
+    <w:name w:val="Footer Char"/>
+    <w:basedOn w:val="DefaultParagraphFont"/>
+    <w:link w:val="Footer"/>
+    <w:uiPriority w:val="99"/>
+    <w:rsid w:val="008F7B2C"/>
+  </w:style>
 </w:styles>
 </file>
 

</xml_diff>